<commit_message>
Half way done task2
</commit_message>
<xml_diff>
--- a/Lab07 ERD Part1.docx
+++ b/Lab07 ERD Part1.docx
@@ -10177,6 +10177,17 @@
               </w:rPr>
               <w:t xml:space="preserve"> </w:t>
             </w:r>
+            <w:r>
+              <w:rPr>
+                <w:rFonts w:ascii="Times New Roman" w:hAnsi="Times New Roman" w:cs="Times New Roman" w:eastAsia="Times New Roman"/>
+                <w:color w:val="000000"/>
+                <w:spacing w:val="0"/>
+                <w:position w:val="0"/>
+                <w:sz w:val="24"/>
+                <w:shd w:fill="auto" w:val="clear"/>
+              </w:rPr>
+              <w:t xml:space="preserve">BOOKS</w:t>
+            </w:r>
           </w:p>
         </w:tc>
         <w:tc>
@@ -10215,7 +10226,7 @@
                 <w:sz w:val="26"/>
                 <w:shd w:fill="auto" w:val="clear"/>
               </w:rPr>
-              <w:t xml:space="preserve"> </w:t>
+              <w:t xml:space="preserve"> Strong</w:t>
             </w:r>
           </w:p>
         </w:tc>
@@ -10255,7 +10266,7 @@
                 <w:sz w:val="26"/>
                 <w:shd w:fill="auto" w:val="clear"/>
               </w:rPr>
-              <w:t xml:space="preserve"> </w:t>
+              <w:t xml:space="preserve"> ISBN</w:t>
             </w:r>
           </w:p>
         </w:tc>
@@ -10384,6 +10395,17 @@
               </w:rPr>
               <w:t xml:space="preserve"> </w:t>
             </w:r>
+            <w:r>
+              <w:rPr>
+                <w:rFonts w:ascii="Times New Roman" w:hAnsi="Times New Roman" w:cs="Times New Roman" w:eastAsia="Times New Roman"/>
+                <w:color w:val="000000"/>
+                <w:spacing w:val="0"/>
+                <w:position w:val="0"/>
+                <w:sz w:val="24"/>
+                <w:shd w:fill="auto" w:val="clear"/>
+              </w:rPr>
+              <w:t xml:space="preserve">AUTHORS</w:t>
+            </w:r>
           </w:p>
         </w:tc>
         <w:tc>
@@ -10422,7 +10444,7 @@
                 <w:sz w:val="26"/>
                 <w:shd w:fill="auto" w:val="clear"/>
               </w:rPr>
-              <w:t xml:space="preserve"> </w:t>
+              <w:t xml:space="preserve"> Strong</w:t>
             </w:r>
           </w:p>
         </w:tc>
@@ -10462,7 +10484,7 @@
                 <w:sz w:val="26"/>
                 <w:shd w:fill="auto" w:val="clear"/>
               </w:rPr>
-              <w:t xml:space="preserve"> </w:t>
+              <w:t xml:space="preserve"> Author ID</w:t>
             </w:r>
           </w:p>
         </w:tc>
@@ -10589,7 +10611,7 @@
                 <w:sz w:val="26"/>
                 <w:shd w:fill="auto" w:val="clear"/>
               </w:rPr>
-              <w:t xml:space="preserve"> </w:t>
+              <w:t xml:space="preserve"> COPIES</w:t>
             </w:r>
           </w:p>
         </w:tc>
@@ -10629,7 +10651,7 @@
                 <w:sz w:val="26"/>
                 <w:shd w:fill="auto" w:val="clear"/>
               </w:rPr>
-              <w:t xml:space="preserve"> </w:t>
+              <w:t xml:space="preserve"> Weak</w:t>
             </w:r>
           </w:p>
         </w:tc>
@@ -10669,7 +10691,7 @@
                 <w:sz w:val="26"/>
                 <w:shd w:fill="auto" w:val="clear"/>
               </w:rPr>
-              <w:t xml:space="preserve"> </w:t>
+              <w:t xml:space="preserve"> Copy number</w:t>
             </w:r>
           </w:p>
         </w:tc>
@@ -10716,7 +10738,7 @@
       </w:tr>
       <w:tr>
         <w:trPr>
-          <w:trHeight w:val="1" w:hRule="atLeast"/>
+          <w:trHeight w:val="435" w:hRule="auto"/>
           <w:jc w:val="left"/>
         </w:trPr>
         <w:tc>
@@ -10796,7 +10818,7 @@
                 <w:sz w:val="26"/>
                 <w:shd w:fill="auto" w:val="clear"/>
               </w:rPr>
-              <w:t xml:space="preserve"> </w:t>
+              <w:t xml:space="preserve"> MEMBERS</w:t>
             </w:r>
           </w:p>
         </w:tc>
@@ -10836,7 +10858,7 @@
                 <w:sz w:val="26"/>
                 <w:shd w:fill="auto" w:val="clear"/>
               </w:rPr>
-              <w:t xml:space="preserve"> </w:t>
+              <w:t xml:space="preserve"> Strong</w:t>
             </w:r>
           </w:p>
         </w:tc>
@@ -10876,7 +10898,7 @@
                 <w:sz w:val="26"/>
                 <w:shd w:fill="auto" w:val="clear"/>
               </w:rPr>
-              <w:t xml:space="preserve"> </w:t>
+              <w:t xml:space="preserve"> Member ID</w:t>
             </w:r>
           </w:p>
         </w:tc>
@@ -10923,7 +10945,7 @@
       </w:tr>
       <w:tr>
         <w:trPr>
-          <w:trHeight w:val="1" w:hRule="atLeast"/>
+          <w:trHeight w:val="435" w:hRule="auto"/>
           <w:jc w:val="left"/>
         </w:trPr>
         <w:tc>
@@ -11003,7 +11025,7 @@
                 <w:sz w:val="26"/>
                 <w:shd w:fill="auto" w:val="clear"/>
               </w:rPr>
-              <w:t xml:space="preserve"> </w:t>
+              <w:t xml:space="preserve"> BORROW RECORDS</w:t>
             </w:r>
           </w:p>
         </w:tc>
@@ -11043,7 +11065,7 @@
                 <w:sz w:val="26"/>
                 <w:shd w:fill="auto" w:val="clear"/>
               </w:rPr>
-              <w:t xml:space="preserve"> </w:t>
+              <w:t xml:space="preserve"> Strong</w:t>
             </w:r>
           </w:p>
         </w:tc>
@@ -11083,7 +11105,7 @@
                 <w:sz w:val="26"/>
                 <w:shd w:fill="auto" w:val="clear"/>
               </w:rPr>
-              <w:t xml:space="preserve"> </w:t>
+              <w:t xml:space="preserve"> Record ID</w:t>
             </w:r>
           </w:p>
         </w:tc>
@@ -11416,7 +11438,7 @@
                 <w:sz w:val="26"/>
                 <w:shd w:fill="auto" w:val="clear"/>
               </w:rPr>
-              <w:t xml:space="preserve"> </w:t>
+              <w:t xml:space="preserve"> BOOKS</w:t>
             </w:r>
           </w:p>
         </w:tc>
@@ -11456,7 +11478,7 @@
                 <w:sz w:val="26"/>
                 <w:shd w:fill="auto" w:val="clear"/>
               </w:rPr>
-              <w:t xml:space="preserve"> </w:t>
+              <w:t xml:space="preserve"> ISBN</w:t>
             </w:r>
           </w:p>
         </w:tc>
@@ -11496,7 +11518,7 @@
                 <w:sz w:val="26"/>
                 <w:shd w:fill="auto" w:val="clear"/>
               </w:rPr>
-              <w:t xml:space="preserve"> </w:t>
+              <w:t xml:space="preserve"> Simple</w:t>
             </w:r>
           </w:p>
         </w:tc>
@@ -11536,7 +11558,7 @@
                 <w:sz w:val="26"/>
                 <w:shd w:fill="auto" w:val="clear"/>
               </w:rPr>
-              <w:t xml:space="preserve"> </w:t>
+              <w:t xml:space="preserve"> PK</w:t>
             </w:r>
           </w:p>
         </w:tc>
@@ -11582,13 +11604,64 @@
                 <w:sz w:val="26"/>
                 <w:shd w:fill="auto" w:val="clear"/>
               </w:rPr>
+              <w:t xml:space="preserve"> AUTHORS</w:t>
+            </w:r>
+          </w:p>
+        </w:tc>
+        <w:tc>
+          <w:tcPr>
+            <w:tcW w:w="2600" w:type="dxa"/>
+            <w:tcBorders>
+              <w:top w:val="single" w:color="d1d5db" w:sz="6"/>
+              <w:left w:val="single" w:color="d1d5db" w:sz="6"/>
+              <w:bottom w:val="single" w:color="d1d5db" w:sz="6"/>
+              <w:right w:val="single" w:color="d1d5db" w:sz="6"/>
+            </w:tcBorders>
+            <w:shd w:color="auto" w:fill="ffffff" w:val="clear"/>
+            <w:tcMar>
+              <w:left w:w="130" w:type="dxa"/>
+              <w:right w:w="130" w:type="dxa"/>
+            </w:tcMar>
+            <w:vAlign w:val="top"/>
+          </w:tcPr>
+          <w:p>
+            <w:pPr>
+              <w:spacing w:before="0" w:after="40" w:line="360"/>
+              <w:ind w:right="0" w:left="0" w:firstLine="0"/>
+              <w:jc w:val="left"/>
+              <w:rPr>
+                <w:spacing w:val="0"/>
+                <w:position w:val="0"/>
+                <w:shd w:fill="auto" w:val="clear"/>
+              </w:rPr>
+            </w:pPr>
+            <w:r>
+              <w:rPr>
+                <w:rFonts w:ascii="Times New Roman" w:hAnsi="Times New Roman" w:cs="Times New Roman" w:eastAsia="Times New Roman"/>
+                <w:color w:val="000000"/>
+                <w:spacing w:val="0"/>
+                <w:position w:val="0"/>
+                <w:sz w:val="26"/>
+                <w:shd w:fill="auto" w:val="clear"/>
+              </w:rPr>
               <w:t xml:space="preserve"> </w:t>
             </w:r>
-          </w:p>
-        </w:tc>
-        <w:tc>
-          <w:tcPr>
-            <w:tcW w:w="2600" w:type="dxa"/>
+            <w:r>
+              <w:rPr>
+                <w:rFonts w:ascii="Times New Roman" w:hAnsi="Times New Roman" w:cs="Times New Roman" w:eastAsia="Times New Roman"/>
+                <w:color w:val="000000"/>
+                <w:spacing w:val="0"/>
+                <w:position w:val="0"/>
+                <w:sz w:val="26"/>
+                <w:shd w:fill="auto" w:val="clear"/>
+              </w:rPr>
+              <w:t xml:space="preserve"> Author ID</w:t>
+            </w:r>
+          </w:p>
+        </w:tc>
+        <w:tc>
+          <w:tcPr>
+            <w:tcW w:w="2400" w:type="dxa"/>
             <w:tcBorders>
               <w:top w:val="single" w:color="d1d5db" w:sz="6"/>
               <w:left w:val="single" w:color="d1d5db" w:sz="6"/>
@@ -11622,13 +11695,13 @@
                 <w:sz w:val="26"/>
                 <w:shd w:fill="auto" w:val="clear"/>
               </w:rPr>
-              <w:t xml:space="preserve"> </w:t>
-            </w:r>
-          </w:p>
-        </w:tc>
-        <w:tc>
-          <w:tcPr>
-            <w:tcW w:w="2400" w:type="dxa"/>
+              <w:t xml:space="preserve"> Simple</w:t>
+            </w:r>
+          </w:p>
+        </w:tc>
+        <w:tc>
+          <w:tcPr>
+            <w:tcW w:w="2466" w:type="dxa"/>
             <w:tcBorders>
               <w:top w:val="single" w:color="d1d5db" w:sz="6"/>
               <w:left w:val="single" w:color="d1d5db" w:sz="6"/>
@@ -11662,47 +11735,7 @@
                 <w:sz w:val="26"/>
                 <w:shd w:fill="auto" w:val="clear"/>
               </w:rPr>
-              <w:t xml:space="preserve"> </w:t>
-            </w:r>
-          </w:p>
-        </w:tc>
-        <w:tc>
-          <w:tcPr>
-            <w:tcW w:w="2466" w:type="dxa"/>
-            <w:tcBorders>
-              <w:top w:val="single" w:color="d1d5db" w:sz="6"/>
-              <w:left w:val="single" w:color="d1d5db" w:sz="6"/>
-              <w:bottom w:val="single" w:color="d1d5db" w:sz="6"/>
-              <w:right w:val="single" w:color="d1d5db" w:sz="6"/>
-            </w:tcBorders>
-            <w:shd w:color="auto" w:fill="ffffff" w:val="clear"/>
-            <w:tcMar>
-              <w:left w:w="130" w:type="dxa"/>
-              <w:right w:w="130" w:type="dxa"/>
-            </w:tcMar>
-            <w:vAlign w:val="top"/>
-          </w:tcPr>
-          <w:p>
-            <w:pPr>
-              <w:spacing w:before="0" w:after="40" w:line="360"/>
-              <w:ind w:right="0" w:left="0" w:firstLine="0"/>
-              <w:jc w:val="left"/>
-              <w:rPr>
-                <w:spacing w:val="0"/>
-                <w:position w:val="0"/>
-                <w:shd w:fill="auto" w:val="clear"/>
-              </w:rPr>
-            </w:pPr>
-            <w:r>
-              <w:rPr>
-                <w:rFonts w:ascii="Times New Roman" w:hAnsi="Times New Roman" w:cs="Times New Roman" w:eastAsia="Times New Roman"/>
-                <w:color w:val="000000"/>
-                <w:spacing w:val="0"/>
-                <w:position w:val="0"/>
-                <w:sz w:val="26"/>
-                <w:shd w:fill="auto" w:val="clear"/>
-              </w:rPr>
-              <w:t xml:space="preserve"> </w:t>
+              <w:t xml:space="preserve"> PK</w:t>
             </w:r>
           </w:p>
         </w:tc>
@@ -11748,13 +11781,64 @@
                 <w:sz w:val="26"/>
                 <w:shd w:fill="auto" w:val="clear"/>
               </w:rPr>
+              <w:t xml:space="preserve"> COPIES</w:t>
+            </w:r>
+          </w:p>
+        </w:tc>
+        <w:tc>
+          <w:tcPr>
+            <w:tcW w:w="2600" w:type="dxa"/>
+            <w:tcBorders>
+              <w:top w:val="single" w:color="d1d5db" w:sz="6"/>
+              <w:left w:val="single" w:color="d1d5db" w:sz="6"/>
+              <w:bottom w:val="single" w:color="d1d5db" w:sz="6"/>
+              <w:right w:val="single" w:color="d1d5db" w:sz="6"/>
+            </w:tcBorders>
+            <w:shd w:color="auto" w:fill="ccfbf1" w:val="clear"/>
+            <w:tcMar>
+              <w:left w:w="130" w:type="dxa"/>
+              <w:right w:w="130" w:type="dxa"/>
+            </w:tcMar>
+            <w:vAlign w:val="top"/>
+          </w:tcPr>
+          <w:p>
+            <w:pPr>
+              <w:spacing w:before="0" w:after="40" w:line="360"/>
+              <w:ind w:right="0" w:left="0" w:firstLine="0"/>
+              <w:jc w:val="left"/>
+              <w:rPr>
+                <w:spacing w:val="0"/>
+                <w:position w:val="0"/>
+                <w:shd w:fill="auto" w:val="clear"/>
+              </w:rPr>
+            </w:pPr>
+            <w:r>
+              <w:rPr>
+                <w:rFonts w:ascii="Times New Roman" w:hAnsi="Times New Roman" w:cs="Times New Roman" w:eastAsia="Times New Roman"/>
+                <w:color w:val="000000"/>
+                <w:spacing w:val="0"/>
+                <w:position w:val="0"/>
+                <w:sz w:val="26"/>
+                <w:shd w:fill="auto" w:val="clear"/>
+              </w:rPr>
               <w:t xml:space="preserve"> </w:t>
             </w:r>
-          </w:p>
-        </w:tc>
-        <w:tc>
-          <w:tcPr>
-            <w:tcW w:w="2600" w:type="dxa"/>
+            <w:r>
+              <w:rPr>
+                <w:rFonts w:ascii="Times New Roman" w:hAnsi="Times New Roman" w:cs="Times New Roman" w:eastAsia="Times New Roman"/>
+                <w:color w:val="000000"/>
+                <w:spacing w:val="0"/>
+                <w:position w:val="0"/>
+                <w:sz w:val="26"/>
+                <w:shd w:fill="auto" w:val="clear"/>
+              </w:rPr>
+              <w:t xml:space="preserve"> Copy number</w:t>
+            </w:r>
+          </w:p>
+        </w:tc>
+        <w:tc>
+          <w:tcPr>
+            <w:tcW w:w="2400" w:type="dxa"/>
             <w:tcBorders>
               <w:top w:val="single" w:color="d1d5db" w:sz="6"/>
               <w:left w:val="single" w:color="d1d5db" w:sz="6"/>
@@ -11788,13 +11872,13 @@
                 <w:sz w:val="26"/>
                 <w:shd w:fill="auto" w:val="clear"/>
               </w:rPr>
-              <w:t xml:space="preserve"> </w:t>
-            </w:r>
-          </w:p>
-        </w:tc>
-        <w:tc>
-          <w:tcPr>
-            <w:tcW w:w="2400" w:type="dxa"/>
+              <w:t xml:space="preserve"> Simple</w:t>
+            </w:r>
+          </w:p>
+        </w:tc>
+        <w:tc>
+          <w:tcPr>
+            <w:tcW w:w="2466" w:type="dxa"/>
             <w:tcBorders>
               <w:top w:val="single" w:color="d1d5db" w:sz="6"/>
               <w:left w:val="single" w:color="d1d5db" w:sz="6"/>
@@ -11828,47 +11912,7 @@
                 <w:sz w:val="26"/>
                 <w:shd w:fill="auto" w:val="clear"/>
               </w:rPr>
-              <w:t xml:space="preserve"> </w:t>
-            </w:r>
-          </w:p>
-        </w:tc>
-        <w:tc>
-          <w:tcPr>
-            <w:tcW w:w="2466" w:type="dxa"/>
-            <w:tcBorders>
-              <w:top w:val="single" w:color="d1d5db" w:sz="6"/>
-              <w:left w:val="single" w:color="d1d5db" w:sz="6"/>
-              <w:bottom w:val="single" w:color="d1d5db" w:sz="6"/>
-              <w:right w:val="single" w:color="d1d5db" w:sz="6"/>
-            </w:tcBorders>
-            <w:shd w:color="auto" w:fill="ccfbf1" w:val="clear"/>
-            <w:tcMar>
-              <w:left w:w="130" w:type="dxa"/>
-              <w:right w:w="130" w:type="dxa"/>
-            </w:tcMar>
-            <w:vAlign w:val="top"/>
-          </w:tcPr>
-          <w:p>
-            <w:pPr>
-              <w:spacing w:before="0" w:after="40" w:line="360"/>
-              <w:ind w:right="0" w:left="0" w:firstLine="0"/>
-              <w:jc w:val="left"/>
-              <w:rPr>
-                <w:spacing w:val="0"/>
-                <w:position w:val="0"/>
-                <w:shd w:fill="auto" w:val="clear"/>
-              </w:rPr>
-            </w:pPr>
-            <w:r>
-              <w:rPr>
-                <w:rFonts w:ascii="Times New Roman" w:hAnsi="Times New Roman" w:cs="Times New Roman" w:eastAsia="Times New Roman"/>
-                <w:color w:val="000000"/>
-                <w:spacing w:val="0"/>
-                <w:position w:val="0"/>
-                <w:sz w:val="26"/>
-                <w:shd w:fill="auto" w:val="clear"/>
-              </w:rPr>
-              <w:t xml:space="preserve"> </w:t>
+              <w:t xml:space="preserve"> Partial</w:t>
             </w:r>
           </w:p>
         </w:tc>
@@ -11914,13 +11958,64 @@
                 <w:sz w:val="26"/>
                 <w:shd w:fill="auto" w:val="clear"/>
               </w:rPr>
+              <w:t xml:space="preserve"> MEMBERS</w:t>
+            </w:r>
+          </w:p>
+        </w:tc>
+        <w:tc>
+          <w:tcPr>
+            <w:tcW w:w="2600" w:type="dxa"/>
+            <w:tcBorders>
+              <w:top w:val="single" w:color="d1d5db" w:sz="6"/>
+              <w:left w:val="single" w:color="d1d5db" w:sz="6"/>
+              <w:bottom w:val="single" w:color="d1d5db" w:sz="6"/>
+              <w:right w:val="single" w:color="d1d5db" w:sz="6"/>
+            </w:tcBorders>
+            <w:shd w:color="auto" w:fill="ffffff" w:val="clear"/>
+            <w:tcMar>
+              <w:left w:w="130" w:type="dxa"/>
+              <w:right w:w="130" w:type="dxa"/>
+            </w:tcMar>
+            <w:vAlign w:val="top"/>
+          </w:tcPr>
+          <w:p>
+            <w:pPr>
+              <w:spacing w:before="0" w:after="40" w:line="360"/>
+              <w:ind w:right="0" w:left="0" w:firstLine="0"/>
+              <w:jc w:val="left"/>
+              <w:rPr>
+                <w:spacing w:val="0"/>
+                <w:position w:val="0"/>
+                <w:shd w:fill="auto" w:val="clear"/>
+              </w:rPr>
+            </w:pPr>
+            <w:r>
+              <w:rPr>
+                <w:rFonts w:ascii="Times New Roman" w:hAnsi="Times New Roman" w:cs="Times New Roman" w:eastAsia="Times New Roman"/>
+                <w:color w:val="000000"/>
+                <w:spacing w:val="0"/>
+                <w:position w:val="0"/>
+                <w:sz w:val="26"/>
+                <w:shd w:fill="auto" w:val="clear"/>
+              </w:rPr>
               <w:t xml:space="preserve"> </w:t>
             </w:r>
-          </w:p>
-        </w:tc>
-        <w:tc>
-          <w:tcPr>
-            <w:tcW w:w="2600" w:type="dxa"/>
+            <w:r>
+              <w:rPr>
+                <w:rFonts w:ascii="Times New Roman" w:hAnsi="Times New Roman" w:cs="Times New Roman" w:eastAsia="Times New Roman"/>
+                <w:color w:val="000000"/>
+                <w:spacing w:val="0"/>
+                <w:position w:val="0"/>
+                <w:sz w:val="26"/>
+                <w:shd w:fill="auto" w:val="clear"/>
+              </w:rPr>
+              <w:t xml:space="preserve"> Member ID</w:t>
+            </w:r>
+          </w:p>
+        </w:tc>
+        <w:tc>
+          <w:tcPr>
+            <w:tcW w:w="2400" w:type="dxa"/>
             <w:tcBorders>
               <w:top w:val="single" w:color="d1d5db" w:sz="6"/>
               <w:left w:val="single" w:color="d1d5db" w:sz="6"/>
@@ -11954,13 +12049,13 @@
                 <w:sz w:val="26"/>
                 <w:shd w:fill="auto" w:val="clear"/>
               </w:rPr>
-              <w:t xml:space="preserve"> </w:t>
-            </w:r>
-          </w:p>
-        </w:tc>
-        <w:tc>
-          <w:tcPr>
-            <w:tcW w:w="2400" w:type="dxa"/>
+              <w:t xml:space="preserve"> Simple</w:t>
+            </w:r>
+          </w:p>
+        </w:tc>
+        <w:tc>
+          <w:tcPr>
+            <w:tcW w:w="2466" w:type="dxa"/>
             <w:tcBorders>
               <w:top w:val="single" w:color="d1d5db" w:sz="6"/>
               <w:left w:val="single" w:color="d1d5db" w:sz="6"/>
@@ -11994,47 +12089,7 @@
                 <w:sz w:val="26"/>
                 <w:shd w:fill="auto" w:val="clear"/>
               </w:rPr>
-              <w:t xml:space="preserve"> </w:t>
-            </w:r>
-          </w:p>
-        </w:tc>
-        <w:tc>
-          <w:tcPr>
-            <w:tcW w:w="2466" w:type="dxa"/>
-            <w:tcBorders>
-              <w:top w:val="single" w:color="d1d5db" w:sz="6"/>
-              <w:left w:val="single" w:color="d1d5db" w:sz="6"/>
-              <w:bottom w:val="single" w:color="d1d5db" w:sz="6"/>
-              <w:right w:val="single" w:color="d1d5db" w:sz="6"/>
-            </w:tcBorders>
-            <w:shd w:color="auto" w:fill="ffffff" w:val="clear"/>
-            <w:tcMar>
-              <w:left w:w="130" w:type="dxa"/>
-              <w:right w:w="130" w:type="dxa"/>
-            </w:tcMar>
-            <w:vAlign w:val="top"/>
-          </w:tcPr>
-          <w:p>
-            <w:pPr>
-              <w:spacing w:before="0" w:after="40" w:line="360"/>
-              <w:ind w:right="0" w:left="0" w:firstLine="0"/>
-              <w:jc w:val="left"/>
-              <w:rPr>
-                <w:spacing w:val="0"/>
-                <w:position w:val="0"/>
-                <w:shd w:fill="auto" w:val="clear"/>
-              </w:rPr>
-            </w:pPr>
-            <w:r>
-              <w:rPr>
-                <w:rFonts w:ascii="Times New Roman" w:hAnsi="Times New Roman" w:cs="Times New Roman" w:eastAsia="Times New Roman"/>
-                <w:color w:val="000000"/>
-                <w:spacing w:val="0"/>
-                <w:position w:val="0"/>
-                <w:sz w:val="26"/>
-                <w:shd w:fill="auto" w:val="clear"/>
-              </w:rPr>
-              <w:t xml:space="preserve"> </w:t>
+              <w:t xml:space="preserve"> PK</w:t>
             </w:r>
           </w:p>
         </w:tc>
@@ -12080,13 +12135,64 @@
                 <w:sz w:val="26"/>
                 <w:shd w:fill="auto" w:val="clear"/>
               </w:rPr>
+              <w:t xml:space="preserve"> BORROW RECORDS</w:t>
+            </w:r>
+          </w:p>
+        </w:tc>
+        <w:tc>
+          <w:tcPr>
+            <w:tcW w:w="2600" w:type="dxa"/>
+            <w:tcBorders>
+              <w:top w:val="single" w:color="d1d5db" w:sz="6"/>
+              <w:left w:val="single" w:color="d1d5db" w:sz="6"/>
+              <w:bottom w:val="single" w:color="d1d5db" w:sz="6"/>
+              <w:right w:val="single" w:color="d1d5db" w:sz="6"/>
+            </w:tcBorders>
+            <w:shd w:color="auto" w:fill="ccfbf1" w:val="clear"/>
+            <w:tcMar>
+              <w:left w:w="130" w:type="dxa"/>
+              <w:right w:w="130" w:type="dxa"/>
+            </w:tcMar>
+            <w:vAlign w:val="top"/>
+          </w:tcPr>
+          <w:p>
+            <w:pPr>
+              <w:spacing w:before="0" w:after="40" w:line="360"/>
+              <w:ind w:right="0" w:left="0" w:firstLine="0"/>
+              <w:jc w:val="left"/>
+              <w:rPr>
+                <w:spacing w:val="0"/>
+                <w:position w:val="0"/>
+                <w:shd w:fill="auto" w:val="clear"/>
+              </w:rPr>
+            </w:pPr>
+            <w:r>
+              <w:rPr>
+                <w:rFonts w:ascii="Times New Roman" w:hAnsi="Times New Roman" w:cs="Times New Roman" w:eastAsia="Times New Roman"/>
+                <w:color w:val="000000"/>
+                <w:spacing w:val="0"/>
+                <w:position w:val="0"/>
+                <w:sz w:val="26"/>
+                <w:shd w:fill="auto" w:val="clear"/>
+              </w:rPr>
+              <w:t xml:space="preserve"> Record ID</w:t>
+            </w:r>
+            <w:r>
+              <w:rPr>
+                <w:rFonts w:ascii="Times New Roman" w:hAnsi="Times New Roman" w:cs="Times New Roman" w:eastAsia="Times New Roman"/>
+                <w:color w:val="000000"/>
+                <w:spacing w:val="0"/>
+                <w:position w:val="0"/>
+                <w:sz w:val="26"/>
+                <w:shd w:fill="auto" w:val="clear"/>
+              </w:rPr>
               <w:t xml:space="preserve"> </w:t>
             </w:r>
           </w:p>
         </w:tc>
         <w:tc>
           <w:tcPr>
-            <w:tcW w:w="2600" w:type="dxa"/>
+            <w:tcW w:w="2400" w:type="dxa"/>
             <w:tcBorders>
               <w:top w:val="single" w:color="d1d5db" w:sz="6"/>
               <w:left w:val="single" w:color="d1d5db" w:sz="6"/>
@@ -12120,13 +12226,13 @@
                 <w:sz w:val="26"/>
                 <w:shd w:fill="auto" w:val="clear"/>
               </w:rPr>
-              <w:t xml:space="preserve"> </w:t>
-            </w:r>
-          </w:p>
-        </w:tc>
-        <w:tc>
-          <w:tcPr>
-            <w:tcW w:w="2400" w:type="dxa"/>
+              <w:t xml:space="preserve"> Simple</w:t>
+            </w:r>
+          </w:p>
+        </w:tc>
+        <w:tc>
+          <w:tcPr>
+            <w:tcW w:w="2466" w:type="dxa"/>
             <w:tcBorders>
               <w:top w:val="single" w:color="d1d5db" w:sz="6"/>
               <w:left w:val="single" w:color="d1d5db" w:sz="6"/>
@@ -12160,47 +12266,7 @@
                 <w:sz w:val="26"/>
                 <w:shd w:fill="auto" w:val="clear"/>
               </w:rPr>
-              <w:t xml:space="preserve"> </w:t>
-            </w:r>
-          </w:p>
-        </w:tc>
-        <w:tc>
-          <w:tcPr>
-            <w:tcW w:w="2466" w:type="dxa"/>
-            <w:tcBorders>
-              <w:top w:val="single" w:color="d1d5db" w:sz="6"/>
-              <w:left w:val="single" w:color="d1d5db" w:sz="6"/>
-              <w:bottom w:val="single" w:color="d1d5db" w:sz="6"/>
-              <w:right w:val="single" w:color="d1d5db" w:sz="6"/>
-            </w:tcBorders>
-            <w:shd w:color="auto" w:fill="ccfbf1" w:val="clear"/>
-            <w:tcMar>
-              <w:left w:w="130" w:type="dxa"/>
-              <w:right w:w="130" w:type="dxa"/>
-            </w:tcMar>
-            <w:vAlign w:val="top"/>
-          </w:tcPr>
-          <w:p>
-            <w:pPr>
-              <w:spacing w:before="0" w:after="40" w:line="360"/>
-              <w:ind w:right="0" w:left="0" w:firstLine="0"/>
-              <w:jc w:val="left"/>
-              <w:rPr>
-                <w:spacing w:val="0"/>
-                <w:position w:val="0"/>
-                <w:shd w:fill="auto" w:val="clear"/>
-              </w:rPr>
-            </w:pPr>
-            <w:r>
-              <w:rPr>
-                <w:rFonts w:ascii="Times New Roman" w:hAnsi="Times New Roman" w:cs="Times New Roman" w:eastAsia="Times New Roman"/>
-                <w:color w:val="000000"/>
-                <w:spacing w:val="0"/>
-                <w:position w:val="0"/>
-                <w:sz w:val="26"/>
-                <w:shd w:fill="auto" w:val="clear"/>
-              </w:rPr>
-              <w:t xml:space="preserve"> </w:t>
+              <w:t xml:space="preserve"> PK</w:t>
             </w:r>
           </w:p>
         </w:tc>

</xml_diff>

<commit_message>
Task2 almost done, only erp draw left
</commit_message>
<xml_diff>
--- a/Lab07 ERD Part1.docx
+++ b/Lab07 ERD Part1.docx
@@ -13729,7 +13729,7 @@
       </w:tr>
       <w:tr>
         <w:trPr>
-          <w:trHeight w:val="1" w:hRule="atLeast"/>
+          <w:trHeight w:val="420" w:hRule="auto"/>
           <w:jc w:val="left"/>
         </w:trPr>
         <w:tc>
@@ -13768,10 +13768,219 @@
                 <w:sz w:val="26"/>
                 <w:shd w:fill="auto" w:val="clear"/>
               </w:rPr>
+              <w:t xml:space="preserve"> 1</w:t>
+            </w:r>
+          </w:p>
+        </w:tc>
+        <w:tc>
+          <w:tcPr>
+            <w:tcW w:w="1982" w:type="dxa"/>
+            <w:tcBorders>
+              <w:top w:val="single" w:color="d1d5db" w:sz="6"/>
+              <w:left w:val="single" w:color="d1d5db" w:sz="6"/>
+              <w:bottom w:val="single" w:color="d1d5db" w:sz="6"/>
+              <w:right w:val="single" w:color="d1d5db" w:sz="6"/>
+            </w:tcBorders>
+            <w:shd w:color="auto" w:fill="f3f4f6" w:val="clear"/>
+            <w:tcMar>
+              <w:left w:w="130" w:type="dxa"/>
+              <w:right w:w="130" w:type="dxa"/>
+            </w:tcMar>
+            <w:vAlign w:val="top"/>
+          </w:tcPr>
+          <w:p>
+            <w:pPr>
+              <w:spacing w:before="0" w:after="40" w:line="360"/>
+              <w:ind w:right="0" w:left="0" w:firstLine="0"/>
+              <w:jc w:val="left"/>
+              <w:rPr>
+                <w:rFonts w:ascii="Calibri" w:hAnsi="Calibri" w:cs="Calibri" w:eastAsia="Calibri"/>
+                <w:color w:val="auto"/>
+                <w:spacing w:val="0"/>
+                <w:position w:val="0"/>
+                <w:sz w:val="28"/>
+                <w:shd w:fill="auto" w:val="clear"/>
+              </w:rPr>
+            </w:pPr>
+            <w:r>
+              <w:rPr>
+                <w:rFonts w:ascii="Calibri" w:hAnsi="Calibri" w:cs="Calibri" w:eastAsia="Calibri"/>
+                <w:color w:val="auto"/>
+                <w:spacing w:val="0"/>
+                <w:position w:val="0"/>
+                <w:sz w:val="28"/>
+                <w:shd w:fill="auto" w:val="clear"/>
+              </w:rPr>
+              <w:t xml:space="preserve">BOOKS</w:t>
+            </w:r>
+          </w:p>
+        </w:tc>
+        <w:tc>
+          <w:tcPr>
+            <w:tcW w:w="2189" w:type="dxa"/>
+            <w:tcBorders>
+              <w:top w:val="single" w:color="d1d5db" w:sz="6"/>
+              <w:left w:val="single" w:color="d1d5db" w:sz="6"/>
+              <w:bottom w:val="single" w:color="d1d5db" w:sz="6"/>
+              <w:right w:val="single" w:color="d1d5db" w:sz="6"/>
+            </w:tcBorders>
+            <w:shd w:color="auto" w:fill="f3f4f6" w:val="clear"/>
+            <w:tcMar>
+              <w:left w:w="130" w:type="dxa"/>
+              <w:right w:w="130" w:type="dxa"/>
+            </w:tcMar>
+            <w:vAlign w:val="top"/>
+          </w:tcPr>
+          <w:p>
+            <w:pPr>
+              <w:spacing w:before="0" w:after="40" w:line="360"/>
+              <w:ind w:right="0" w:left="0" w:firstLine="0"/>
+              <w:jc w:val="left"/>
+              <w:rPr>
+                <w:spacing w:val="0"/>
+                <w:position w:val="0"/>
+                <w:shd w:fill="auto" w:val="clear"/>
+              </w:rPr>
+            </w:pPr>
+            <w:r>
+              <w:rPr>
+                <w:rFonts w:ascii="Times New Roman" w:hAnsi="Times New Roman" w:cs="Times New Roman" w:eastAsia="Times New Roman"/>
+                <w:color w:val="000000"/>
+                <w:spacing w:val="0"/>
+                <w:position w:val="0"/>
+                <w:sz w:val="26"/>
+                <w:shd w:fill="auto" w:val="clear"/>
+              </w:rPr>
+              <w:t xml:space="preserve"> Has</w:t>
+            </w:r>
+          </w:p>
+        </w:tc>
+        <w:tc>
+          <w:tcPr>
+            <w:tcW w:w="1983" w:type="dxa"/>
+            <w:tcBorders>
+              <w:top w:val="single" w:color="d1d5db" w:sz="6"/>
+              <w:left w:val="single" w:color="d1d5db" w:sz="6"/>
+              <w:bottom w:val="single" w:color="d1d5db" w:sz="6"/>
+              <w:right w:val="single" w:color="d1d5db" w:sz="6"/>
+            </w:tcBorders>
+            <w:shd w:color="auto" w:fill="f3f4f6" w:val="clear"/>
+            <w:tcMar>
+              <w:left w:w="130" w:type="dxa"/>
+              <w:right w:w="130" w:type="dxa"/>
+            </w:tcMar>
+            <w:vAlign w:val="top"/>
+          </w:tcPr>
+          <w:p>
+            <w:pPr>
+              <w:spacing w:before="0" w:after="40" w:line="360"/>
+              <w:ind w:right="0" w:left="0" w:firstLine="0"/>
+              <w:jc w:val="left"/>
+              <w:rPr>
+                <w:spacing w:val="0"/>
+                <w:position w:val="0"/>
+                <w:shd w:fill="auto" w:val="clear"/>
+              </w:rPr>
+            </w:pPr>
+            <w:r>
+              <w:rPr>
+                <w:rFonts w:ascii="Times New Roman" w:hAnsi="Times New Roman" w:cs="Times New Roman" w:eastAsia="Times New Roman"/>
+                <w:color w:val="000000"/>
+                <w:spacing w:val="0"/>
+                <w:position w:val="0"/>
+                <w:sz w:val="26"/>
+                <w:shd w:fill="auto" w:val="clear"/>
+              </w:rPr>
+              <w:t xml:space="preserve"> COPIES</w:t>
+            </w:r>
+          </w:p>
+        </w:tc>
+        <w:tc>
+          <w:tcPr>
+            <w:tcW w:w="3042" w:type="dxa"/>
+            <w:tcBorders>
+              <w:top w:val="single" w:color="d1d5db" w:sz="6"/>
+              <w:left w:val="single" w:color="d1d5db" w:sz="6"/>
+              <w:bottom w:val="single" w:color="d1d5db" w:sz="6"/>
+              <w:right w:val="single" w:color="d1d5db" w:sz="6"/>
+            </w:tcBorders>
+            <w:shd w:color="auto" w:fill="f3f4f6" w:val="clear"/>
+            <w:tcMar>
+              <w:left w:w="130" w:type="dxa"/>
+              <w:right w:w="130" w:type="dxa"/>
+            </w:tcMar>
+            <w:vAlign w:val="top"/>
+          </w:tcPr>
+          <w:p>
+            <w:pPr>
+              <w:spacing w:before="0" w:after="40" w:line="360"/>
+              <w:ind w:right="0" w:left="0" w:firstLine="0"/>
+              <w:jc w:val="left"/>
+              <w:rPr>
+                <w:spacing w:val="0"/>
+                <w:position w:val="0"/>
+                <w:shd w:fill="auto" w:val="clear"/>
+              </w:rPr>
+            </w:pPr>
+            <w:r>
+              <w:rPr>
+                <w:rFonts w:ascii="Times New Roman" w:hAnsi="Times New Roman" w:cs="Times New Roman" w:eastAsia="Times New Roman"/>
+                <w:color w:val="000000"/>
+                <w:spacing w:val="0"/>
+                <w:position w:val="0"/>
+                <w:sz w:val="26"/>
+                <w:shd w:fill="auto" w:val="clear"/>
+              </w:rPr>
               <w:t xml:space="preserve"> </w:t>
             </w:r>
           </w:p>
         </w:tc>
+      </w:tr>
+      <w:tr>
+        <w:trPr>
+          <w:trHeight w:val="510" w:hRule="auto"/>
+          <w:jc w:val="left"/>
+        </w:trPr>
+        <w:tc>
+          <w:tcPr>
+            <w:tcW w:w="370" w:type="dxa"/>
+            <w:tcBorders>
+              <w:top w:val="single" w:color="d1d5db" w:sz="6"/>
+              <w:left w:val="single" w:color="d1d5db" w:sz="6"/>
+              <w:bottom w:val="single" w:color="d1d5db" w:sz="6"/>
+              <w:right w:val="single" w:color="d1d5db" w:sz="6"/>
+            </w:tcBorders>
+            <w:shd w:color="auto" w:fill="ffffff" w:val="clear"/>
+            <w:tcMar>
+              <w:left w:w="130" w:type="dxa"/>
+              <w:right w:w="130" w:type="dxa"/>
+            </w:tcMar>
+            <w:vAlign w:val="top"/>
+          </w:tcPr>
+          <w:p>
+            <w:pPr>
+              <w:spacing w:before="0" w:after="40" w:line="360"/>
+              <w:ind w:right="0" w:left="0" w:firstLine="0"/>
+              <w:jc w:val="left"/>
+              <w:rPr>
+                <w:spacing w:val="0"/>
+                <w:position w:val="0"/>
+                <w:shd w:fill="auto" w:val="clear"/>
+              </w:rPr>
+            </w:pPr>
+            <w:r>
+              <w:rPr>
+                <w:rFonts w:ascii="Times New Roman" w:hAnsi="Times New Roman" w:cs="Times New Roman" w:eastAsia="Times New Roman"/>
+                <w:color w:val="000000"/>
+                <w:spacing w:val="0"/>
+                <w:position w:val="0"/>
+                <w:sz w:val="26"/>
+                <w:shd w:fill="auto" w:val="clear"/>
+              </w:rPr>
+              <w:t xml:space="preserve">2 </w:t>
+            </w:r>
+          </w:p>
+        </w:tc>
         <w:tc>
           <w:tcPr>
             <w:tcW w:w="1982" w:type="dxa"/>
@@ -13781,7 +13990,7 @@
               <w:bottom w:val="single" w:color="d1d5db" w:sz="6"/>
               <w:right w:val="single" w:color="d1d5db" w:sz="6"/>
             </w:tcBorders>
-            <w:shd w:color="auto" w:fill="f3f4f6" w:val="clear"/>
+            <w:shd w:color="auto" w:fill="ffffff" w:val="clear"/>
             <w:tcMar>
               <w:left w:w="130" w:type="dxa"/>
               <w:right w:w="130" w:type="dxa"/>
@@ -13794,6 +14003,49 @@
               <w:ind w:right="0" w:left="0" w:firstLine="0"/>
               <w:jc w:val="left"/>
               <w:rPr>
+                <w:rFonts w:ascii="Calibri" w:hAnsi="Calibri" w:cs="Calibri" w:eastAsia="Calibri"/>
+                <w:color w:val="auto"/>
+                <w:spacing w:val="0"/>
+                <w:position w:val="0"/>
+                <w:sz w:val="28"/>
+                <w:shd w:fill="auto" w:val="clear"/>
+              </w:rPr>
+            </w:pPr>
+            <w:r>
+              <w:rPr>
+                <w:rFonts w:ascii="Calibri" w:hAnsi="Calibri" w:cs="Calibri" w:eastAsia="Calibri"/>
+                <w:color w:val="auto"/>
+                <w:spacing w:val="0"/>
+                <w:position w:val="0"/>
+                <w:sz w:val="28"/>
+                <w:shd w:fill="auto" w:val="clear"/>
+              </w:rPr>
+              <w:t xml:space="preserve">AUTHORS</w:t>
+            </w:r>
+          </w:p>
+        </w:tc>
+        <w:tc>
+          <w:tcPr>
+            <w:tcW w:w="2189" w:type="dxa"/>
+            <w:tcBorders>
+              <w:top w:val="single" w:color="d1d5db" w:sz="6"/>
+              <w:left w:val="single" w:color="d1d5db" w:sz="6"/>
+              <w:bottom w:val="single" w:color="d1d5db" w:sz="6"/>
+              <w:right w:val="single" w:color="d1d5db" w:sz="6"/>
+            </w:tcBorders>
+            <w:shd w:color="auto" w:fill="ffffff" w:val="clear"/>
+            <w:tcMar>
+              <w:left w:w="130" w:type="dxa"/>
+              <w:right w:w="130" w:type="dxa"/>
+            </w:tcMar>
+            <w:vAlign w:val="top"/>
+          </w:tcPr>
+          <w:p>
+            <w:pPr>
+              <w:spacing w:before="0" w:after="40" w:line="360"/>
+              <w:ind w:right="0" w:left="0" w:firstLine="0"/>
+              <w:jc w:val="left"/>
+              <w:rPr>
                 <w:spacing w:val="0"/>
                 <w:position w:val="0"/>
                 <w:shd w:fill="auto" w:val="clear"/>
@@ -13808,20 +14060,20 @@
                 <w:sz w:val="26"/>
                 <w:shd w:fill="auto" w:val="clear"/>
               </w:rPr>
-              <w:t xml:space="preserve"> </w:t>
-            </w:r>
-          </w:p>
-        </w:tc>
-        <w:tc>
-          <w:tcPr>
-            <w:tcW w:w="2189" w:type="dxa"/>
-            <w:tcBorders>
-              <w:top w:val="single" w:color="d1d5db" w:sz="6"/>
-              <w:left w:val="single" w:color="d1d5db" w:sz="6"/>
-              <w:bottom w:val="single" w:color="d1d5db" w:sz="6"/>
-              <w:right w:val="single" w:color="d1d5db" w:sz="6"/>
-            </w:tcBorders>
-            <w:shd w:color="auto" w:fill="f3f4f6" w:val="clear"/>
+              <w:t xml:space="preserve"> Write</w:t>
+            </w:r>
+          </w:p>
+        </w:tc>
+        <w:tc>
+          <w:tcPr>
+            <w:tcW w:w="1983" w:type="dxa"/>
+            <w:tcBorders>
+              <w:top w:val="single" w:color="d1d5db" w:sz="6"/>
+              <w:left w:val="single" w:color="d1d5db" w:sz="6"/>
+              <w:bottom w:val="single" w:color="d1d5db" w:sz="6"/>
+              <w:right w:val="single" w:color="d1d5db" w:sz="6"/>
+            </w:tcBorders>
+            <w:shd w:color="auto" w:fill="ffffff" w:val="clear"/>
             <w:tcMar>
               <w:left w:w="130" w:type="dxa"/>
               <w:right w:w="130" w:type="dxa"/>
@@ -13848,47 +14100,7 @@
                 <w:sz w:val="26"/>
                 <w:shd w:fill="auto" w:val="clear"/>
               </w:rPr>
-              <w:t xml:space="preserve"> </w:t>
-            </w:r>
-          </w:p>
-        </w:tc>
-        <w:tc>
-          <w:tcPr>
-            <w:tcW w:w="1983" w:type="dxa"/>
-            <w:tcBorders>
-              <w:top w:val="single" w:color="d1d5db" w:sz="6"/>
-              <w:left w:val="single" w:color="d1d5db" w:sz="6"/>
-              <w:bottom w:val="single" w:color="d1d5db" w:sz="6"/>
-              <w:right w:val="single" w:color="d1d5db" w:sz="6"/>
-            </w:tcBorders>
-            <w:shd w:color="auto" w:fill="f3f4f6" w:val="clear"/>
-            <w:tcMar>
-              <w:left w:w="130" w:type="dxa"/>
-              <w:right w:w="130" w:type="dxa"/>
-            </w:tcMar>
-            <w:vAlign w:val="top"/>
-          </w:tcPr>
-          <w:p>
-            <w:pPr>
-              <w:spacing w:before="0" w:after="40" w:line="360"/>
-              <w:ind w:right="0" w:left="0" w:firstLine="0"/>
-              <w:jc w:val="left"/>
-              <w:rPr>
-                <w:spacing w:val="0"/>
-                <w:position w:val="0"/>
-                <w:shd w:fill="auto" w:val="clear"/>
-              </w:rPr>
-            </w:pPr>
-            <w:r>
-              <w:rPr>
-                <w:rFonts w:ascii="Times New Roman" w:hAnsi="Times New Roman" w:cs="Times New Roman" w:eastAsia="Times New Roman"/>
-                <w:color w:val="000000"/>
-                <w:spacing w:val="0"/>
-                <w:position w:val="0"/>
-                <w:sz w:val="26"/>
-                <w:shd w:fill="auto" w:val="clear"/>
-              </w:rPr>
-              <w:t xml:space="preserve"> </w:t>
+              <w:t xml:space="preserve"> BOOKS</w:t>
             </w:r>
           </w:p>
         </w:tc>
@@ -13901,7 +14113,7 @@
               <w:bottom w:val="single" w:color="d1d5db" w:sz="6"/>
               <w:right w:val="single" w:color="d1d5db" w:sz="6"/>
             </w:tcBorders>
-            <w:shd w:color="auto" w:fill="f3f4f6" w:val="clear"/>
+            <w:shd w:color="auto" w:fill="ffffff" w:val="clear"/>
             <w:tcMar>
               <w:left w:w="130" w:type="dxa"/>
               <w:right w:w="130" w:type="dxa"/>
@@ -13947,7 +14159,7 @@
               <w:bottom w:val="single" w:color="d1d5db" w:sz="6"/>
               <w:right w:val="single" w:color="d1d5db" w:sz="6"/>
             </w:tcBorders>
-            <w:shd w:color="auto" w:fill="ffffff" w:val="clear"/>
+            <w:shd w:color="auto" w:fill="f3f4f6" w:val="clear"/>
             <w:tcMar>
               <w:left w:w="130" w:type="dxa"/>
               <w:right w:w="130" w:type="dxa"/>
@@ -13974,7 +14186,7 @@
                 <w:sz w:val="26"/>
                 <w:shd w:fill="auto" w:val="clear"/>
               </w:rPr>
-              <w:t xml:space="preserve"> </w:t>
+              <w:t xml:space="preserve">3 </w:t>
             </w:r>
           </w:p>
         </w:tc>
@@ -13987,7 +14199,7 @@
               <w:bottom w:val="single" w:color="d1d5db" w:sz="6"/>
               <w:right w:val="single" w:color="d1d5db" w:sz="6"/>
             </w:tcBorders>
-            <w:shd w:color="auto" w:fill="ffffff" w:val="clear"/>
+            <w:shd w:color="auto" w:fill="f3f4f6" w:val="clear"/>
             <w:tcMar>
               <w:left w:w="130" w:type="dxa"/>
               <w:right w:w="130" w:type="dxa"/>
@@ -14014,7 +14226,7 @@
                 <w:sz w:val="26"/>
                 <w:shd w:fill="auto" w:val="clear"/>
               </w:rPr>
-              <w:t xml:space="preserve"> </w:t>
+              <w:t xml:space="preserve"> COPIES</w:t>
             </w:r>
           </w:p>
         </w:tc>
@@ -14027,7 +14239,7 @@
               <w:bottom w:val="single" w:color="d1d5db" w:sz="6"/>
               <w:right w:val="single" w:color="d1d5db" w:sz="6"/>
             </w:tcBorders>
-            <w:shd w:color="auto" w:fill="ffffff" w:val="clear"/>
+            <w:shd w:color="auto" w:fill="f3f4f6" w:val="clear"/>
             <w:tcMar>
               <w:left w:w="130" w:type="dxa"/>
               <w:right w:w="130" w:type="dxa"/>
@@ -14054,7 +14266,7 @@
                 <w:sz w:val="26"/>
                 <w:shd w:fill="auto" w:val="clear"/>
               </w:rPr>
-              <w:t xml:space="preserve"> </w:t>
+              <w:t xml:space="preserve"> Borrowed In</w:t>
             </w:r>
           </w:p>
         </w:tc>
@@ -14067,7 +14279,7 @@
               <w:bottom w:val="single" w:color="d1d5db" w:sz="6"/>
               <w:right w:val="single" w:color="d1d5db" w:sz="6"/>
             </w:tcBorders>
-            <w:shd w:color="auto" w:fill="ffffff" w:val="clear"/>
+            <w:shd w:color="auto" w:fill="f3f4f6" w:val="clear"/>
             <w:tcMar>
               <w:left w:w="130" w:type="dxa"/>
               <w:right w:w="130" w:type="dxa"/>
@@ -14094,7 +14306,7 @@
                 <w:sz w:val="26"/>
                 <w:shd w:fill="auto" w:val="clear"/>
               </w:rPr>
-              <w:t xml:space="preserve"> </w:t>
+              <w:t xml:space="preserve"> BORROW RECORDS</w:t>
             </w:r>
           </w:p>
         </w:tc>
@@ -14107,7 +14319,7 @@
               <w:bottom w:val="single" w:color="d1d5db" w:sz="6"/>
               <w:right w:val="single" w:color="d1d5db" w:sz="6"/>
             </w:tcBorders>
-            <w:shd w:color="auto" w:fill="ffffff" w:val="clear"/>
+            <w:shd w:color="auto" w:fill="f3f4f6" w:val="clear"/>
             <w:tcMar>
               <w:left w:w="130" w:type="dxa"/>
               <w:right w:w="130" w:type="dxa"/>
@@ -14153,7 +14365,7 @@
               <w:bottom w:val="single" w:color="d1d5db" w:sz="6"/>
               <w:right w:val="single" w:color="d1d5db" w:sz="6"/>
             </w:tcBorders>
-            <w:shd w:color="auto" w:fill="f3f4f6" w:val="clear"/>
+            <w:shd w:color="auto" w:fill="ffffff" w:val="clear"/>
             <w:tcMar>
               <w:left w:w="130" w:type="dxa"/>
               <w:right w:w="130" w:type="dxa"/>
@@ -14180,7 +14392,7 @@
                 <w:sz w:val="26"/>
                 <w:shd w:fill="auto" w:val="clear"/>
               </w:rPr>
-              <w:t xml:space="preserve"> </w:t>
+              <w:t xml:space="preserve">4 </w:t>
             </w:r>
           </w:p>
         </w:tc>
@@ -14193,7 +14405,7 @@
               <w:bottom w:val="single" w:color="d1d5db" w:sz="6"/>
               <w:right w:val="single" w:color="d1d5db" w:sz="6"/>
             </w:tcBorders>
-            <w:shd w:color="auto" w:fill="f3f4f6" w:val="clear"/>
+            <w:shd w:color="auto" w:fill="ffffff" w:val="clear"/>
             <w:tcMar>
               <w:left w:w="130" w:type="dxa"/>
               <w:right w:w="130" w:type="dxa"/>
@@ -14220,7 +14432,7 @@
                 <w:sz w:val="26"/>
                 <w:shd w:fill="auto" w:val="clear"/>
               </w:rPr>
-              <w:t xml:space="preserve"> </w:t>
+              <w:t xml:space="preserve"> MEMBERS</w:t>
             </w:r>
           </w:p>
         </w:tc>
@@ -14233,7 +14445,7 @@
               <w:bottom w:val="single" w:color="d1d5db" w:sz="6"/>
               <w:right w:val="single" w:color="d1d5db" w:sz="6"/>
             </w:tcBorders>
-            <w:shd w:color="auto" w:fill="f3f4f6" w:val="clear"/>
+            <w:shd w:color="auto" w:fill="ffffff" w:val="clear"/>
             <w:tcMar>
               <w:left w:w="130" w:type="dxa"/>
               <w:right w:w="130" w:type="dxa"/>
@@ -14260,7 +14472,7 @@
                 <w:sz w:val="26"/>
                 <w:shd w:fill="auto" w:val="clear"/>
               </w:rPr>
-              <w:t xml:space="preserve"> </w:t>
+              <w:t xml:space="preserve"> Create</w:t>
             </w:r>
           </w:p>
         </w:tc>
@@ -14273,7 +14485,7 @@
               <w:bottom w:val="single" w:color="d1d5db" w:sz="6"/>
               <w:right w:val="single" w:color="d1d5db" w:sz="6"/>
             </w:tcBorders>
-            <w:shd w:color="auto" w:fill="f3f4f6" w:val="clear"/>
+            <w:shd w:color="auto" w:fill="ffffff" w:val="clear"/>
             <w:tcMar>
               <w:left w:w="130" w:type="dxa"/>
               <w:right w:w="130" w:type="dxa"/>
@@ -14300,213 +14512,7 @@
                 <w:sz w:val="26"/>
                 <w:shd w:fill="auto" w:val="clear"/>
               </w:rPr>
-              <w:t xml:space="preserve"> </w:t>
-            </w:r>
-          </w:p>
-        </w:tc>
-        <w:tc>
-          <w:tcPr>
-            <w:tcW w:w="3042" w:type="dxa"/>
-            <w:tcBorders>
-              <w:top w:val="single" w:color="d1d5db" w:sz="6"/>
-              <w:left w:val="single" w:color="d1d5db" w:sz="6"/>
-              <w:bottom w:val="single" w:color="d1d5db" w:sz="6"/>
-              <w:right w:val="single" w:color="d1d5db" w:sz="6"/>
-            </w:tcBorders>
-            <w:shd w:color="auto" w:fill="f3f4f6" w:val="clear"/>
-            <w:tcMar>
-              <w:left w:w="130" w:type="dxa"/>
-              <w:right w:w="130" w:type="dxa"/>
-            </w:tcMar>
-            <w:vAlign w:val="top"/>
-          </w:tcPr>
-          <w:p>
-            <w:pPr>
-              <w:spacing w:before="0" w:after="40" w:line="360"/>
-              <w:ind w:right="0" w:left="0" w:firstLine="0"/>
-              <w:jc w:val="left"/>
-              <w:rPr>
-                <w:spacing w:val="0"/>
-                <w:position w:val="0"/>
-                <w:shd w:fill="auto" w:val="clear"/>
-              </w:rPr>
-            </w:pPr>
-            <w:r>
-              <w:rPr>
-                <w:rFonts w:ascii="Times New Roman" w:hAnsi="Times New Roman" w:cs="Times New Roman" w:eastAsia="Times New Roman"/>
-                <w:color w:val="000000"/>
-                <w:spacing w:val="0"/>
-                <w:position w:val="0"/>
-                <w:sz w:val="26"/>
-                <w:shd w:fill="auto" w:val="clear"/>
-              </w:rPr>
-              <w:t xml:space="preserve"> </w:t>
-            </w:r>
-          </w:p>
-        </w:tc>
-      </w:tr>
-      <w:tr>
-        <w:trPr>
-          <w:trHeight w:val="1" w:hRule="atLeast"/>
-          <w:jc w:val="left"/>
-        </w:trPr>
-        <w:tc>
-          <w:tcPr>
-            <w:tcW w:w="370" w:type="dxa"/>
-            <w:tcBorders>
-              <w:top w:val="single" w:color="d1d5db" w:sz="6"/>
-              <w:left w:val="single" w:color="d1d5db" w:sz="6"/>
-              <w:bottom w:val="single" w:color="d1d5db" w:sz="6"/>
-              <w:right w:val="single" w:color="d1d5db" w:sz="6"/>
-            </w:tcBorders>
-            <w:shd w:color="auto" w:fill="ffffff" w:val="clear"/>
-            <w:tcMar>
-              <w:left w:w="130" w:type="dxa"/>
-              <w:right w:w="130" w:type="dxa"/>
-            </w:tcMar>
-            <w:vAlign w:val="top"/>
-          </w:tcPr>
-          <w:p>
-            <w:pPr>
-              <w:spacing w:before="0" w:after="40" w:line="360"/>
-              <w:ind w:right="0" w:left="0" w:firstLine="0"/>
-              <w:jc w:val="left"/>
-              <w:rPr>
-                <w:spacing w:val="0"/>
-                <w:position w:val="0"/>
-                <w:shd w:fill="auto" w:val="clear"/>
-              </w:rPr>
-            </w:pPr>
-            <w:r>
-              <w:rPr>
-                <w:rFonts w:ascii="Times New Roman" w:hAnsi="Times New Roman" w:cs="Times New Roman" w:eastAsia="Times New Roman"/>
-                <w:color w:val="000000"/>
-                <w:spacing w:val="0"/>
-                <w:position w:val="0"/>
-                <w:sz w:val="26"/>
-                <w:shd w:fill="auto" w:val="clear"/>
-              </w:rPr>
-              <w:t xml:space="preserve"> </w:t>
-            </w:r>
-          </w:p>
-        </w:tc>
-        <w:tc>
-          <w:tcPr>
-            <w:tcW w:w="1982" w:type="dxa"/>
-            <w:tcBorders>
-              <w:top w:val="single" w:color="d1d5db" w:sz="6"/>
-              <w:left w:val="single" w:color="d1d5db" w:sz="6"/>
-              <w:bottom w:val="single" w:color="d1d5db" w:sz="6"/>
-              <w:right w:val="single" w:color="d1d5db" w:sz="6"/>
-            </w:tcBorders>
-            <w:shd w:color="auto" w:fill="ffffff" w:val="clear"/>
-            <w:tcMar>
-              <w:left w:w="130" w:type="dxa"/>
-              <w:right w:w="130" w:type="dxa"/>
-            </w:tcMar>
-            <w:vAlign w:val="top"/>
-          </w:tcPr>
-          <w:p>
-            <w:pPr>
-              <w:spacing w:before="0" w:after="40" w:line="360"/>
-              <w:ind w:right="0" w:left="0" w:firstLine="0"/>
-              <w:jc w:val="left"/>
-              <w:rPr>
-                <w:spacing w:val="0"/>
-                <w:position w:val="0"/>
-                <w:shd w:fill="auto" w:val="clear"/>
-              </w:rPr>
-            </w:pPr>
-            <w:r>
-              <w:rPr>
-                <w:rFonts w:ascii="Times New Roman" w:hAnsi="Times New Roman" w:cs="Times New Roman" w:eastAsia="Times New Roman"/>
-                <w:color w:val="000000"/>
-                <w:spacing w:val="0"/>
-                <w:position w:val="0"/>
-                <w:sz w:val="26"/>
-                <w:shd w:fill="auto" w:val="clear"/>
-              </w:rPr>
-              <w:t xml:space="preserve"> </w:t>
-            </w:r>
-          </w:p>
-        </w:tc>
-        <w:tc>
-          <w:tcPr>
-            <w:tcW w:w="2189" w:type="dxa"/>
-            <w:tcBorders>
-              <w:top w:val="single" w:color="d1d5db" w:sz="6"/>
-              <w:left w:val="single" w:color="d1d5db" w:sz="6"/>
-              <w:bottom w:val="single" w:color="d1d5db" w:sz="6"/>
-              <w:right w:val="single" w:color="d1d5db" w:sz="6"/>
-            </w:tcBorders>
-            <w:shd w:color="auto" w:fill="ffffff" w:val="clear"/>
-            <w:tcMar>
-              <w:left w:w="130" w:type="dxa"/>
-              <w:right w:w="130" w:type="dxa"/>
-            </w:tcMar>
-            <w:vAlign w:val="top"/>
-          </w:tcPr>
-          <w:p>
-            <w:pPr>
-              <w:spacing w:before="0" w:after="40" w:line="360"/>
-              <w:ind w:right="0" w:left="0" w:firstLine="0"/>
-              <w:jc w:val="left"/>
-              <w:rPr>
-                <w:spacing w:val="0"/>
-                <w:position w:val="0"/>
-                <w:shd w:fill="auto" w:val="clear"/>
-              </w:rPr>
-            </w:pPr>
-            <w:r>
-              <w:rPr>
-                <w:rFonts w:ascii="Times New Roman" w:hAnsi="Times New Roman" w:cs="Times New Roman" w:eastAsia="Times New Roman"/>
-                <w:color w:val="000000"/>
-                <w:spacing w:val="0"/>
-                <w:position w:val="0"/>
-                <w:sz w:val="26"/>
-                <w:shd w:fill="auto" w:val="clear"/>
-              </w:rPr>
-              <w:t xml:space="preserve"> </w:t>
-            </w:r>
-          </w:p>
-        </w:tc>
-        <w:tc>
-          <w:tcPr>
-            <w:tcW w:w="1983" w:type="dxa"/>
-            <w:tcBorders>
-              <w:top w:val="single" w:color="d1d5db" w:sz="6"/>
-              <w:left w:val="single" w:color="d1d5db" w:sz="6"/>
-              <w:bottom w:val="single" w:color="d1d5db" w:sz="6"/>
-              <w:right w:val="single" w:color="d1d5db" w:sz="6"/>
-            </w:tcBorders>
-            <w:shd w:color="auto" w:fill="ffffff" w:val="clear"/>
-            <w:tcMar>
-              <w:left w:w="130" w:type="dxa"/>
-              <w:right w:w="130" w:type="dxa"/>
-            </w:tcMar>
-            <w:vAlign w:val="top"/>
-          </w:tcPr>
-          <w:p>
-            <w:pPr>
-              <w:spacing w:before="0" w:after="40" w:line="360"/>
-              <w:ind w:right="0" w:left="0" w:firstLine="0"/>
-              <w:jc w:val="left"/>
-              <w:rPr>
-                <w:spacing w:val="0"/>
-                <w:position w:val="0"/>
-                <w:shd w:fill="auto" w:val="clear"/>
-              </w:rPr>
-            </w:pPr>
-            <w:r>
-              <w:rPr>
-                <w:rFonts w:ascii="Times New Roman" w:hAnsi="Times New Roman" w:cs="Times New Roman" w:eastAsia="Times New Roman"/>
-                <w:color w:val="000000"/>
-                <w:spacing w:val="0"/>
-                <w:position w:val="0"/>
-                <w:sz w:val="26"/>
-                <w:shd w:fill="auto" w:val="clear"/>
-              </w:rPr>
-              <w:t xml:space="preserve"> </w:t>
+              <w:t xml:space="preserve"> BORROW RECORDS</w:t>
             </w:r>
           </w:p>
         </w:tc>
@@ -15298,7 +15304,7 @@
                 <w:sz w:val="26"/>
                 <w:shd w:fill="auto" w:val="clear"/>
               </w:rPr>
-              <w:t xml:space="preserve"> </w:t>
+              <w:t xml:space="preserve"> 1</w:t>
             </w:r>
           </w:p>
         </w:tc>
@@ -15338,7 +15344,7 @@
                 <w:sz w:val="26"/>
                 <w:shd w:fill="auto" w:val="clear"/>
               </w:rPr>
-              <w:t xml:space="preserve"> </w:t>
+              <w:t xml:space="preserve"> AUTHORS - BOOKS</w:t>
             </w:r>
           </w:p>
         </w:tc>
@@ -15378,7 +15384,7 @@
                 <w:sz w:val="26"/>
                 <w:shd w:fill="auto" w:val="clear"/>
               </w:rPr>
-              <w:t xml:space="preserve"> </w:t>
+              <w:t xml:space="preserve"> M:N</w:t>
             </w:r>
           </w:p>
         </w:tc>
@@ -15504,7 +15510,7 @@
                 <w:sz w:val="26"/>
                 <w:shd w:fill="auto" w:val="clear"/>
               </w:rPr>
-              <w:t xml:space="preserve"> </w:t>
+              <w:t xml:space="preserve">2 </w:t>
             </w:r>
           </w:p>
         </w:tc>
@@ -15544,7 +15550,7 @@
                 <w:sz w:val="26"/>
                 <w:shd w:fill="auto" w:val="clear"/>
               </w:rPr>
-              <w:t xml:space="preserve"> </w:t>
+              <w:t xml:space="preserve"> BOOKS - COPIES</w:t>
             </w:r>
           </w:p>
         </w:tc>
@@ -15584,7 +15590,7 @@
                 <w:sz w:val="26"/>
                 <w:shd w:fill="auto" w:val="clear"/>
               </w:rPr>
-              <w:t xml:space="preserve"> </w:t>
+              <w:t xml:space="preserve"> 1:N</w:t>
             </w:r>
           </w:p>
         </w:tc>
@@ -15710,7 +15716,7 @@
                 <w:sz w:val="26"/>
                 <w:shd w:fill="auto" w:val="clear"/>
               </w:rPr>
-              <w:t xml:space="preserve"> </w:t>
+              <w:t xml:space="preserve">3 </w:t>
             </w:r>
           </w:p>
         </w:tc>
@@ -15750,7 +15756,7 @@
                 <w:sz w:val="26"/>
                 <w:shd w:fill="auto" w:val="clear"/>
               </w:rPr>
-              <w:t xml:space="preserve"> </w:t>
+              <w:t xml:space="preserve"> MEMBERS - BORROW RECORDS</w:t>
             </w:r>
           </w:p>
         </w:tc>
@@ -15790,7 +15796,7 @@
                 <w:sz w:val="26"/>
                 <w:shd w:fill="auto" w:val="clear"/>
               </w:rPr>
-              <w:t xml:space="preserve"> </w:t>
+              <w:t xml:space="preserve"> 1:N</w:t>
             </w:r>
           </w:p>
         </w:tc>
@@ -15916,7 +15922,7 @@
                 <w:sz w:val="26"/>
                 <w:shd w:fill="auto" w:val="clear"/>
               </w:rPr>
-              <w:t xml:space="preserve"> </w:t>
+              <w:t xml:space="preserve">4 </w:t>
             </w:r>
           </w:p>
         </w:tc>
@@ -15956,7 +15962,7 @@
                 <w:sz w:val="26"/>
                 <w:shd w:fill="auto" w:val="clear"/>
               </w:rPr>
-              <w:t xml:space="preserve"> </w:t>
+              <w:t xml:space="preserve"> COPIES - BORROW RECORDS</w:t>
             </w:r>
           </w:p>
         </w:tc>
@@ -15996,7 +16002,7 @@
                 <w:sz w:val="26"/>
                 <w:shd w:fill="auto" w:val="clear"/>
               </w:rPr>
-              <w:t xml:space="preserve"> </w:t>
+              <w:t xml:space="preserve"> 1:N</w:t>
             </w:r>
           </w:p>
         </w:tc>

</xml_diff>

<commit_message>
Done task2, moving to task 3
</commit_message>
<xml_diff>
--- a/Lab07 ERD Part1.docx
+++ b/Lab07 ERD Part1.docx
@@ -17082,17 +17082,10 @@
           </w:p>
           <w:p>
             <w:pPr>
-              <w:spacing w:before="60" w:after="400" w:line="360"/>
+              <w:spacing w:before="60" w:after="400" w:line="240"/>
               <w:ind w:right="0" w:left="0" w:firstLine="0"/>
               <w:jc w:val="center"/>
               <w:rPr>
-                <w:spacing w:val="0"/>
-                <w:position w:val="0"/>
-                <w:shd w:fill="auto" w:val="clear"/>
-              </w:rPr>
-            </w:pPr>
-            <w:r>
-              <w:rPr>
                 <w:rFonts w:ascii="Times New Roman" w:hAnsi="Times New Roman" w:cs="Times New Roman" w:eastAsia="Times New Roman"/>
                 <w:color w:val="374151"/>
                 <w:spacing w:val="0"/>
@@ -17100,8 +17093,28 @@
                 <w:sz w:val="22"/>
                 <w:shd w:fill="auto" w:val="clear"/>
               </w:rPr>
-              <w:t xml:space="preserve">(Export from ERDPlus as PNG and insert image)</w:t>
-            </w:r>
+            </w:pPr>
+            <w:r>
+              <w:object w:dxaOrig="8640" w:dyaOrig="4949">
+                <v:rect xmlns:o="urn:schemas-microsoft-com:office:office" xmlns:v="urn:schemas-microsoft-com:vml" id="rectole0000000000" style="width:432.000000pt;height:247.450000pt" o:preferrelative="t" o:ole="">
+                  <o:lock v:ext="edit"/>
+                  <v:imagedata xmlns:r="http://schemas.openxmlformats.org/officeDocument/2006/relationships" r:id="docRId1" o:title=""/>
+                </v:rect>
+                <o:OLEObject xmlns:r="http://schemas.openxmlformats.org/officeDocument/2006/relationships" xmlns:o="urn:schemas-microsoft-com:office:office" Type="Embed" ProgID="StaticMetafile" DrawAspect="Content" ObjectID="0000000000" ShapeID="rectole0000000000" r:id="docRId0"/>
+              </w:object>
+            </w:r>
+          </w:p>
+          <w:p>
+            <w:pPr>
+              <w:spacing w:before="0" w:after="0" w:line="240"/>
+              <w:ind w:right="0" w:left="0" w:firstLine="0"/>
+              <w:jc w:val="center"/>
+              <w:rPr>
+                <w:spacing w:val="0"/>
+                <w:position w:val="0"/>
+                <w:shd w:fill="auto" w:val="clear"/>
+              </w:rPr>
+            </w:pPr>
           </w:p>
         </w:tc>
       </w:tr>
@@ -17307,7 +17320,7 @@
             <w:pPr>
               <w:numPr>
                 <w:ilvl w:val="0"/>
-                <w:numId w:val="458"/>
+                <w:numId w:val="459"/>
               </w:numPr>
               <w:spacing w:before="40" w:after="40" w:line="360"/>
               <w:ind w:right="0" w:left="560" w:hanging="280"/>
@@ -17337,7 +17350,7 @@
             <w:pPr>
               <w:numPr>
                 <w:ilvl w:val="0"/>
-                <w:numId w:val="458"/>
+                <w:numId w:val="459"/>
               </w:numPr>
               <w:spacing w:before="40" w:after="40" w:line="360"/>
               <w:ind w:right="0" w:left="560" w:hanging="280"/>
@@ -17367,7 +17380,7 @@
             <w:pPr>
               <w:numPr>
                 <w:ilvl w:val="0"/>
-                <w:numId w:val="458"/>
+                <w:numId w:val="459"/>
               </w:numPr>
               <w:spacing w:before="40" w:after="40" w:line="360"/>
               <w:ind w:right="0" w:left="560" w:hanging="280"/>
@@ -17397,7 +17410,7 @@
             <w:pPr>
               <w:numPr>
                 <w:ilvl w:val="0"/>
-                <w:numId w:val="458"/>
+                <w:numId w:val="459"/>
               </w:numPr>
               <w:spacing w:before="40" w:after="40" w:line="360"/>
               <w:ind w:right="0" w:left="560" w:hanging="280"/>
@@ -17427,7 +17440,7 @@
             <w:pPr>
               <w:numPr>
                 <w:ilvl w:val="0"/>
-                <w:numId w:val="458"/>
+                <w:numId w:val="459"/>
               </w:numPr>
               <w:spacing w:before="40" w:after="40" w:line="360"/>
               <w:ind w:right="0" w:left="560" w:hanging="280"/>
@@ -17841,6 +17854,17 @@
               </w:rPr>
               <w:t xml:space="preserve"> </w:t>
             </w:r>
+            <w:r>
+              <w:rPr>
+                <w:rFonts w:ascii="Times New Roman" w:hAnsi="Times New Roman" w:cs="Times New Roman" w:eastAsia="Times New Roman"/>
+                <w:color w:val="000000"/>
+                <w:spacing w:val="0"/>
+                <w:position w:val="0"/>
+                <w:sz w:val="24"/>
+                <w:shd w:fill="auto" w:val="clear"/>
+              </w:rPr>
+              <w:t xml:space="preserve">CUSTOMERS</w:t>
+            </w:r>
           </w:p>
         </w:tc>
         <w:tc>
@@ -17879,7 +17903,7 @@
                 <w:sz w:val="26"/>
                 <w:shd w:fill="auto" w:val="clear"/>
               </w:rPr>
-              <w:t xml:space="preserve"> </w:t>
+              <w:t xml:space="preserve"> Customer ID</w:t>
             </w:r>
           </w:p>
         </w:tc>
@@ -18007,6 +18031,17 @@
               </w:rPr>
               <w:t xml:space="preserve"> </w:t>
             </w:r>
+            <w:r>
+              <w:rPr>
+                <w:rFonts w:ascii="Times New Roman" w:hAnsi="Times New Roman" w:cs="Times New Roman" w:eastAsia="Times New Roman"/>
+                <w:color w:val="000000"/>
+                <w:spacing w:val="0"/>
+                <w:position w:val="0"/>
+                <w:sz w:val="24"/>
+                <w:shd w:fill="auto" w:val="clear"/>
+              </w:rPr>
+              <w:t xml:space="preserve">BOOKS</w:t>
+            </w:r>
           </w:p>
         </w:tc>
         <w:tc>
@@ -18045,7 +18080,7 @@
                 <w:sz w:val="26"/>
                 <w:shd w:fill="auto" w:val="clear"/>
               </w:rPr>
-              <w:t xml:space="preserve"> </w:t>
+              <w:t xml:space="preserve"> Book ID</w:t>
             </w:r>
           </w:p>
         </w:tc>
@@ -18173,6 +18208,17 @@
               </w:rPr>
               <w:t xml:space="preserve"> </w:t>
             </w:r>
+            <w:r>
+              <w:rPr>
+                <w:rFonts w:ascii="Times New Roman" w:hAnsi="Times New Roman" w:cs="Times New Roman" w:eastAsia="Times New Roman"/>
+                <w:color w:val="000000"/>
+                <w:spacing w:val="0"/>
+                <w:position w:val="0"/>
+                <w:sz w:val="24"/>
+                <w:shd w:fill="auto" w:val="clear"/>
+              </w:rPr>
+              <w:t xml:space="preserve">AUTHORS &amp; CATEGORIES</w:t>
+            </w:r>
           </w:p>
         </w:tc>
         <w:tc>
@@ -18211,7 +18257,7 @@
                 <w:sz w:val="26"/>
                 <w:shd w:fill="auto" w:val="clear"/>
               </w:rPr>
-              <w:t xml:space="preserve"> </w:t>
+              <w:t xml:space="preserve"> Author ID, Category ID</w:t>
             </w:r>
           </w:p>
         </w:tc>
@@ -18339,6 +18385,17 @@
               </w:rPr>
               <w:t xml:space="preserve"> </w:t>
             </w:r>
+            <w:r>
+              <w:rPr>
+                <w:rFonts w:ascii="Times New Roman" w:hAnsi="Times New Roman" w:cs="Times New Roman" w:eastAsia="Times New Roman"/>
+                <w:color w:val="000000"/>
+                <w:spacing w:val="0"/>
+                <w:position w:val="0"/>
+                <w:sz w:val="24"/>
+                <w:shd w:fill="auto" w:val="clear"/>
+              </w:rPr>
+              <w:t xml:space="preserve">ORDERS</w:t>
+            </w:r>
           </w:p>
         </w:tc>
         <w:tc>
@@ -18377,7 +18434,7 @@
                 <w:sz w:val="26"/>
                 <w:shd w:fill="auto" w:val="clear"/>
               </w:rPr>
-              <w:t xml:space="preserve"> </w:t>
+              <w:t xml:space="preserve"> Order ID</w:t>
             </w:r>
           </w:p>
         </w:tc>
@@ -18505,6 +18562,17 @@
               </w:rPr>
               <w:t xml:space="preserve"> </w:t>
             </w:r>
+            <w:r>
+              <w:rPr>
+                <w:rFonts w:ascii="Times New Roman" w:hAnsi="Times New Roman" w:cs="Times New Roman" w:eastAsia="Times New Roman"/>
+                <w:color w:val="000000"/>
+                <w:spacing w:val="0"/>
+                <w:position w:val="0"/>
+                <w:sz w:val="24"/>
+                <w:shd w:fill="auto" w:val="clear"/>
+              </w:rPr>
+              <w:t xml:space="preserve">REVIEWS</w:t>
+            </w:r>
           </w:p>
         </w:tc>
         <w:tc>
@@ -18543,7 +18611,7 @@
                 <w:sz w:val="26"/>
                 <w:shd w:fill="auto" w:val="clear"/>
               </w:rPr>
-              <w:t xml:space="preserve"> </w:t>
+              <w:t xml:space="preserve"> Customer ID + Book ID</w:t>
             </w:r>
           </w:p>
         </w:tc>
@@ -18669,7 +18737,7 @@
                 <w:sz w:val="26"/>
                 <w:shd w:fill="auto" w:val="clear"/>
               </w:rPr>
-              <w:t xml:space="preserve"> </w:t>
+              <w:t xml:space="preserve"> SHIPPING_ADDRESS</w:t>
             </w:r>
           </w:p>
         </w:tc>
@@ -18709,7 +18777,7 @@
                 <w:sz w:val="26"/>
                 <w:shd w:fill="auto" w:val="clear"/>
               </w:rPr>
-              <w:t xml:space="preserve"> </w:t>
+              <w:t xml:space="preserve">Street, District, City </w:t>
             </w:r>
           </w:p>
         </w:tc>
@@ -18835,7 +18903,7 @@
                 <w:sz w:val="26"/>
                 <w:shd w:fill="auto" w:val="clear"/>
               </w:rPr>
-              <w:t xml:space="preserve"> </w:t>
+              <w:t xml:space="preserve"> ORDER_DETAILS</w:t>
             </w:r>
           </w:p>
         </w:tc>
@@ -18875,7 +18943,7 @@
                 <w:sz w:val="26"/>
                 <w:shd w:fill="auto" w:val="clear"/>
               </w:rPr>
-              <w:t xml:space="preserve"> </w:t>
+              <w:t xml:space="preserve">Order ID + Book ID </w:t>
             </w:r>
           </w:p>
         </w:tc>
@@ -19786,7 +19854,7 @@
             <w:pPr>
               <w:numPr>
                 <w:ilvl w:val="0"/>
-                <w:numId w:val="531"/>
+                <w:numId w:val="532"/>
               </w:numPr>
               <w:spacing w:before="40" w:after="40" w:line="360"/>
               <w:ind w:right="0" w:left="560" w:hanging="280"/>
@@ -19836,7 +19904,7 @@
             <w:pPr>
               <w:numPr>
                 <w:ilvl w:val="0"/>
-                <w:numId w:val="531"/>
+                <w:numId w:val="532"/>
               </w:numPr>
               <w:spacing w:before="40" w:after="40" w:line="360"/>
               <w:ind w:right="0" w:left="560" w:hanging="280"/>
@@ -19886,7 +19954,7 @@
             <w:pPr>
               <w:numPr>
                 <w:ilvl w:val="0"/>
-                <w:numId w:val="531"/>
+                <w:numId w:val="532"/>
               </w:numPr>
               <w:spacing w:before="40" w:after="40" w:line="360"/>
               <w:ind w:right="0" w:left="560" w:hanging="280"/>
@@ -20087,16 +20155,16 @@
   <w:num w:numId="443">
     <w:abstractNumId w:val="24"/>
   </w:num>
-  <w:num w:numId="458">
+  <w:num w:numId="459">
     <w:abstractNumId w:val="18"/>
   </w:num>
-  <w:num w:numId="531">
+  <w:num w:numId="532">
     <w:abstractNumId w:val="12"/>
   </w:num>
-  <w:num w:numId="533">
+  <w:num w:numId="534">
     <w:abstractNumId w:val="6"/>
   </w:num>
-  <w:num w:numId="535">
+  <w:num w:numId="536">
     <w:abstractNumId w:val="0"/>
   </w:num>
 </w:numbering>

</xml_diff>